<commit_message>
Docs: Update Table 1 and individual reflection
</commit_message>
<xml_diff>
--- a/Assignment_04_Spring2026.docx
+++ b/Assignment_04_Spring2026.docx
@@ -797,12 +797,12 @@
       </w:tblPr>
       <w:tblGrid>
         <w:gridCol w:w="471"/>
-        <w:gridCol w:w="1424"/>
-        <w:gridCol w:w="1349"/>
+        <w:gridCol w:w="1402"/>
+        <w:gridCol w:w="1339"/>
         <w:gridCol w:w="1561"/>
-        <w:gridCol w:w="1306"/>
-        <w:gridCol w:w="1596"/>
-        <w:gridCol w:w="1653"/>
+        <w:gridCol w:w="1296"/>
+        <w:gridCol w:w="1651"/>
+        <w:gridCol w:w="1640"/>
       </w:tblGrid>
       <w:tr>
         <w:trPr>
@@ -1690,7 +1690,11 @@
             </w:tcMar>
             <w:vAlign w:val="center"/>
           </w:tcPr>
-          <w:p/>
+          <w:p>
+            <w:r>
+              <w:t>Yasir Masood</w:t>
+            </w:r>
+          </w:p>
         </w:tc>
         <w:tc>
           <w:tcPr>
@@ -1710,7 +1714,16 @@
             </w:tcMar>
             <w:vAlign w:val="center"/>
           </w:tcPr>
-          <w:p/>
+          <w:p>
+            <w:r>
+              <w:t>Sleek-</w:t>
+            </w:r>
+            <w:proofErr w:type="spellStart"/>
+            <w:r>
+              <w:t>Cheems</w:t>
+            </w:r>
+            <w:proofErr w:type="spellEnd"/>
+          </w:p>
         </w:tc>
         <w:tc>
           <w:tcPr>
@@ -1730,7 +1743,11 @@
             </w:tcMar>
             <w:vAlign w:val="center"/>
           </w:tcPr>
-          <w:p/>
+          <w:p>
+            <w:r>
+              <w:t>Member 5</w:t>
+            </w:r>
+          </w:p>
         </w:tc>
         <w:tc>
           <w:tcPr>
@@ -1750,7 +1767,11 @@
             </w:tcMar>
             <w:vAlign w:val="center"/>
           </w:tcPr>
-          <w:p/>
+          <w:p>
+            <w:r>
+              <w:t>About page</w:t>
+            </w:r>
+          </w:p>
         </w:tc>
         <w:tc>
           <w:tcPr>
@@ -1770,7 +1791,19 @@
             </w:tcMar>
             <w:vAlign w:val="center"/>
           </w:tcPr>
-          <w:p/>
+          <w:p>
+            <w:r>
+              <w:t>feature/Sleek-</w:t>
+            </w:r>
+            <w:proofErr w:type="spellStart"/>
+            <w:r>
+              <w:t>Cheems</w:t>
+            </w:r>
+            <w:proofErr w:type="spellEnd"/>
+            <w:r>
+              <w:t>/about</w:t>
+            </w:r>
+          </w:p>
         </w:tc>
         <w:tc>
           <w:tcPr>
@@ -2873,7 +2906,6 @@
           <w:bCs/>
           <w:color w:val="000000"/>
         </w:rPr>
-        <w:lastRenderedPageBreak/>
         <w:t>Each member's individual workflow:</w:t>
       </w:r>
     </w:p>
@@ -10979,7 +11011,25 @@
           <w:bCs/>
           <w:color w:val="000000"/>
         </w:rPr>
-        <w:t>Name: _______________________________________________)</w:t>
+        <w:t xml:space="preserve">Name: </w:t>
+      </w:r>
+      <w:r>
+        <w:rPr>
+          <w:rFonts w:ascii="Arial" w:eastAsia="Arial" w:hAnsi="Arial" w:cs="Arial"/>
+          <w:b/>
+          <w:bCs/>
+          <w:color w:val="000000"/>
+        </w:rPr>
+        <w:t>Yasir Masood</w:t>
+      </w:r>
+      <w:r>
+        <w:rPr>
+          <w:rFonts w:ascii="Arial" w:eastAsia="Arial" w:hAnsi="Arial" w:cs="Arial"/>
+          <w:b/>
+          <w:bCs/>
+          <w:color w:val="000000"/>
+        </w:rPr>
+        <w:t>)</w:t>
       </w:r>
     </w:p>
     <w:tbl>
@@ -11021,51 +11071,39 @@
             </w:tcMar>
             <w:vAlign w:val="center"/>
           </w:tcPr>
-          <w:p/>
-        </w:tc>
-      </w:tr>
-      <w:tr>
-        <w:tc>
-          <w:tcPr>
-            <w:tcW w:w="9360" w:type="dxa"/>
-            <w:tcBorders>
-              <w:top w:val="single" w:sz="6" w:space="0" w:color="ADB9CA"/>
-              <w:left w:val="single" w:sz="6" w:space="0" w:color="ADB9CA"/>
-              <w:bottom w:val="single" w:sz="6" w:space="0" w:color="ADB9CA"/>
-              <w:right w:val="single" w:sz="6" w:space="0" w:color="ADB9CA"/>
-            </w:tcBorders>
-            <w:shd w:val="clear" w:color="auto" w:fill="FFFFFF"/>
-            <w:tcMar>
-              <w:top w:w="80" w:type="dxa"/>
-              <w:left w:w="140" w:type="dxa"/>
-              <w:bottom w:w="80" w:type="dxa"/>
-              <w:right w:w="140" w:type="dxa"/>
-            </w:tcMar>
-            <w:vAlign w:val="center"/>
-          </w:tcPr>
-          <w:p/>
-        </w:tc>
-      </w:tr>
-      <w:tr>
-        <w:tc>
-          <w:tcPr>
-            <w:tcW w:w="9360" w:type="dxa"/>
-            <w:tcBorders>
-              <w:top w:val="single" w:sz="6" w:space="0" w:color="ADB9CA"/>
-              <w:left w:val="single" w:sz="6" w:space="0" w:color="ADB9CA"/>
-              <w:bottom w:val="single" w:sz="6" w:space="0" w:color="ADB9CA"/>
-              <w:right w:val="single" w:sz="6" w:space="0" w:color="ADB9CA"/>
-            </w:tcBorders>
-            <w:shd w:val="clear" w:color="auto" w:fill="FFFFFF"/>
-            <w:tcMar>
-              <w:top w:w="80" w:type="dxa"/>
-              <w:left w:w="140" w:type="dxa"/>
-              <w:bottom w:w="80" w:type="dxa"/>
-              <w:right w:w="140" w:type="dxa"/>
-            </w:tcMar>
-            <w:vAlign w:val="center"/>
-          </w:tcPr>
-          <w:p/>
+          <w:p>
+            <w:r>
+              <w:t xml:space="preserve">Getting to know the how git actions </w:t>
+            </w:r>
+            <w:proofErr w:type="gramStart"/>
+            <w:r>
+              <w:t>actually interact</w:t>
+            </w:r>
+            <w:proofErr w:type="gramEnd"/>
+            <w:r>
+              <w:t xml:space="preserve"> </w:t>
+            </w:r>
+            <w:r>
+              <w:t xml:space="preserve">and </w:t>
+            </w:r>
+            <w:r>
+              <w:t>how strict Git branching strategies and precise naming conventions prevent merge conflicts and ensure clean automated tracking in a shared team repository.</w:t>
+            </w:r>
+            <w:r>
+              <w:t xml:space="preserve"> And as I made a mistake of not using my </w:t>
+            </w:r>
+            <w:proofErr w:type="spellStart"/>
+            <w:r>
+              <w:t>github</w:t>
+            </w:r>
+            <w:proofErr w:type="spellEnd"/>
+            <w:r>
+              <w:t xml:space="preserve"> username at first,</w:t>
+            </w:r>
+            <w:r>
+              <w:t xml:space="preserve"> was correcting initial branch setup mismatches and managing the tracking states before finalizing my Pull Request.</w:t>
+            </w:r>
+          </w:p>
         </w:tc>
       </w:tr>
     </w:tbl>
@@ -12159,7 +12197,6 @@
   <w:style w:type="character" w:default="1" w:styleId="DefaultParagraphFont">
     <w:name w:val="Default Paragraph Font"/>
     <w:uiPriority w:val="1"/>
-    <w:semiHidden/>
     <w:unhideWhenUsed/>
   </w:style>
   <w:style w:type="table" w:default="1" w:styleId="TableNormal">

</xml_diff>